<commit_message>
Gaura-krishnodaya 15.59: literal 'who composed the Bhagavatamrita' (user decision); rebuild
Co-Authored-By: Claude Opus 5.5 <noreply@anthropic.com>
Claude-Session: https://claude.ai/code/session_01KGC2T1PiSRGJe48WTtGST9
</commit_message>
<xml_diff>
--- a/gaura-krishnodaya/Gaura-Krishnodaya-en.docx
+++ b/gaura-krishnodaya/Gaura-Krishnodaya-en.docx
@@ -24386,7 +24386,7 @@
         <w:t>59.</w:t>
       </w:r>
       <w:r>
-        <w:t xml:space="preserve"> The Puranas and Agamas set forth many injunctions for His worship; having pondered these words, a person becomes free of doubt. Therefore everything here has been set forth by me, following the </w:t>
+        <w:t xml:space="preserve"> The Puranas and Agamas set forth many injunctions for His worship; having pondered these words, a person becomes free of doubt. Therefore everything here has been set forth by me, who composed the </w:t>
       </w:r>
       <w:r>
         <w:rPr>
@@ -24856,7 +24856,7 @@
         <w:rPr>
           <w:sz w:val="18"/>
         </w:rPr>
-        <w:t>); if it is the poet's insertion, it refers to one of these works as his source. The rendering "following" is by the sense, favouring the second reading; the passage is disputed.</w:t>
+        <w:t>); if it is the poet's insertion, it refers to one of these works as his source. The rendering is literal.</w:t>
       </w:r>
     </w:p>
     <w:p>

</xml_diff>